<commit_message>
Fix empty footer in KYCC pareceres so Word can open them
The build script truncated word/footer1.xml before reading it; rebuilt
the Foxbit, Parfin and Mezapro pareceres with the footer filled in.

Co-Authored-By: Claude Opus 5.5 <noreply@anthropic.com>
Claude-Session: https://claude.ai/code/session_01D38vWLyWtPHMFUEPJkK2cH
</commit_message>
<xml_diff>
--- a/pareceres/Parecer_KYCC_FoxbitOTC_PAR-AVD-KYCC-20261014-002.docx
+++ b/pareceres/Parecer_KYCC_FoxbitOTC_PAR-AVD-KYCC-20261014-002.docx
@@ -1380,7 +1380,126 @@
 </w:endnotes>
 </file>
 
-<file path=word/footer1.xml>
+<file path=word/footer1.xml><?xml version="1.0" encoding="utf-8"?>
+<w:ftr xmlns:wpc="http://schemas.microsoft.com/office/word/2010/wordprocessingCanvas" xmlns:cx="http://schemas.microsoft.com/office/drawing/2014/chartex" xmlns:cx1="http://schemas.microsoft.com/office/drawing/2015/9/8/chartex" xmlns:cx2="http://schemas.microsoft.com/office/drawing/2015/10/21/chartex" xmlns:cx3="http://schemas.microsoft.com/office/drawing/2016/5/9/chartex" xmlns:cx4="http://schemas.microsoft.com/office/drawing/2016/5/10/chartex" xmlns:cx5="http://schemas.microsoft.com/office/drawing/2016/5/11/chartex" xmlns:cx6="http://schemas.microsoft.com/office/drawing/2016/5/12/chartex" xmlns:cx7="http://schemas.microsoft.com/office/drawing/2016/5/13/chartex" xmlns:cx8="http://schemas.microsoft.com/office/drawing/2016/5/14/chartex" xmlns:mc="http://schemas.openxmlformats.org/markup-compatibility/2006" xmlns:aink="http://schemas.microsoft.com/office/drawing/2016/ink" xmlns:am3d="http://schemas.microsoft.com/office/drawing/2017/model3d" xmlns:o="urn:schemas-microsoft-com:office:office" xmlns:oel="http://schemas.microsoft.com/office/2019/extlst" xmlns:r="http://schemas.openxmlformats.org/officeDocument/2006/relationships" xmlns:m="http://schemas.openxmlformats.org/officeDocument/2006/math" xmlns:v="urn:schemas-microsoft-com:vml" xmlns:wp14="http://schemas.microsoft.com/office/word/2010/wordprocessingDrawing" xmlns:wp="http://schemas.openxmlformats.org/drawingml/2006/wordprocessingDrawing" xmlns:w10="urn:schemas-microsoft-com:office:word" xmlns:w="http://schemas.openxmlformats.org/wordprocessingml/2006/main" xmlns:w14="http://schemas.microsoft.com/office/word/2010/wordml" xmlns:w15="http://schemas.microsoft.com/office/word/2012/wordml" xmlns:w16cex="http://schemas.microsoft.com/office/word/2018/wordml/cex" xmlns:w16cid="http://schemas.microsoft.com/office/word/2016/wordml/cid" xmlns:w16="http://schemas.microsoft.com/office/word/2018/wordml" xmlns:w16du="http://schemas.microsoft.com/office/word/2023/wordml/word16du" xmlns:w16sdtdh="http://schemas.microsoft.com/office/word/2020/wordml/sdtdatahash" xmlns:w16sdtfl="http://schemas.microsoft.com/office/word/2024/wordml/sdtformatlock" xmlns:w16se="http://schemas.microsoft.com/office/word/2015/wordml/symex" xmlns:wpg="http://schemas.microsoft.com/office/word/2010/wordprocessingGroup" xmlns:wpi="http://schemas.microsoft.com/office/word/2010/wordprocessingInk" xmlns:wne="http://schemas.microsoft.com/office/word/2006/wordml" xmlns:wps="http://schemas.microsoft.com/office/word/2010/wordprocessingShape" mc:Ignorable="w14 w15 w16se w16cid w16 w16cex w16sdtdh w16sdtfl w16du wp14">
+  <w:p>
+    <w:pPr>
+      <w:pBdr>
+        <w:top w:val="single" w:sz="4" w:space="4" w:color="C9CCD3"/>
+      </w:pBdr>
+      <w:tabs>
+        <w:tab w:val="right" w:pos="10206"/>
+      </w:tabs>
+    </w:pPr>
+    <w:r>
+      <w:rPr>
+        <w:color w:val="5A5F6B"/>
+        <w:sz w:val="14"/>
+        <w:szCs w:val="14"/>
+      </w:rPr>
+      <w:t>PAR-AVD-KYCC-20261014-002 · CONFIDENCIAL — USO INTERNO</w:t>
+    </w:r>
+    <w:r>
+      <w:rPr>
+        <w:color w:val="5A5F6B"/>
+        <w:sz w:val="14"/>
+        <w:szCs w:val="14"/>
+      </w:rPr>
+      <w:tab/>
+      <w:t xml:space="preserve">Página </w:t>
+    </w:r>
+    <w:r>
+      <w:rPr>
+        <w:color w:val="5A5F6B"/>
+        <w:sz w:val="14"/>
+        <w:szCs w:val="14"/>
+      </w:rPr>
+      <w:fldChar w:fldCharType="begin"/>
+    </w:r>
+    <w:r>
+      <w:rPr>
+        <w:color w:val="5A5F6B"/>
+        <w:sz w:val="14"/>
+        <w:szCs w:val="14"/>
+      </w:rPr>
+      <w:instrText>PAGE</w:instrText>
+    </w:r>
+    <w:r>
+      <w:rPr>
+        <w:color w:val="5A5F6B"/>
+        <w:sz w:val="14"/>
+        <w:szCs w:val="14"/>
+      </w:rPr>
+      <w:fldChar w:fldCharType="separate"/>
+    </w:r>
+    <w:r>
+      <w:rPr>
+        <w:noProof/>
+        <w:color w:val="5A5F6B"/>
+        <w:sz w:val="14"/>
+        <w:szCs w:val="14"/>
+      </w:rPr>
+      <w:t>1</w:t>
+    </w:r>
+    <w:r>
+      <w:rPr>
+        <w:color w:val="5A5F6B"/>
+        <w:sz w:val="14"/>
+        <w:szCs w:val="14"/>
+      </w:rPr>
+      <w:fldChar w:fldCharType="end"/>
+    </w:r>
+    <w:r>
+      <w:rPr>
+        <w:color w:val="5A5F6B"/>
+        <w:sz w:val="14"/>
+        <w:szCs w:val="14"/>
+      </w:rPr>
+      <w:t xml:space="preserve"> de </w:t>
+    </w:r>
+    <w:r>
+      <w:rPr>
+        <w:color w:val="5A5F6B"/>
+        <w:sz w:val="14"/>
+        <w:szCs w:val="14"/>
+      </w:rPr>
+      <w:fldChar w:fldCharType="begin"/>
+    </w:r>
+    <w:r>
+      <w:rPr>
+        <w:color w:val="5A5F6B"/>
+        <w:sz w:val="14"/>
+        <w:szCs w:val="14"/>
+      </w:rPr>
+      <w:instrText>NUMPAGES</w:instrText>
+    </w:r>
+    <w:r>
+      <w:rPr>
+        <w:color w:val="5A5F6B"/>
+        <w:sz w:val="14"/>
+        <w:szCs w:val="14"/>
+      </w:rPr>
+      <w:fldChar w:fldCharType="separate"/>
+    </w:r>
+    <w:r>
+      <w:rPr>
+        <w:noProof/>
+        <w:color w:val="5A5F6B"/>
+        <w:sz w:val="14"/>
+        <w:szCs w:val="14"/>
+      </w:rPr>
+      <w:t>2</w:t>
+    </w:r>
+    <w:r>
+      <w:rPr>
+        <w:color w:val="5A5F6B"/>
+        <w:sz w:val="14"/>
+        <w:szCs w:val="14"/>
+      </w:rPr>
+      <w:fldChar w:fldCharType="end"/>
+    </w:r>
+  </w:p>
+</w:ftr>
 </file>
 
 <file path=word/footnotes.xml><?xml version="1.0" encoding="utf-8"?>

</xml_diff>